<commit_message>
Complete portfolio audit and resume sync
</commit_message>
<xml_diff>
--- a/downloads/Leonid_Chekin_Resume_AI_RAG_ATS.docx
+++ b/downloads/Leonid_Chekin_Resume_AI_RAG_ATS.docx
@@ -32,8 +32,27 @@
         <w:jc w:val="center"/>
       </w:pPr>
       <w:r>
-        <w:t>Telegram: @leonchek97  |  GitHub: github.com/leonidchekin55  |  Portfolio: leonid-portfolio.onrender.com</w:t>
+        <w:t xml:space="preserve">Telegram: @leonchek97  |  GitHub: </w:t>
       </w:r>
+      <w:hyperlink r:id="rId9">
+        <w:r>
+          <w:rPr>
+            <w:rStyle w:val="Hyperlink"/>
+          </w:rPr>
+          <w:t>github.com/leonidchekin55</w:t>
+        </w:r>
+      </w:hyperlink>
+      <w:r>
+        <w:t xml:space="preserve">  |  Portfolio: </w:t>
+      </w:r>
+      <w:hyperlink r:id="rId10">
+        <w:r>
+          <w:rPr>
+            <w:rStyle w:val="Hyperlink"/>
+          </w:rPr>
+          <w:t>leonid-portfolio.onrender.com</w:t>
+        </w:r>
+      </w:hyperlink>
     </w:p>
     <w:p>
       <w:pPr>

</xml_diff>

<commit_message>
Publish AI portfolio tour and targeted resumes
</commit_message>
<xml_diff>
--- a/downloads/Leonid_Chekin_Resume_AI_RAG_ATS.docx
+++ b/downloads/Leonid_Chekin_Resume_AI_RAG_ATS.docx
@@ -32,27 +32,8 @@
         <w:jc w:val="center"/>
       </w:pPr>
       <w:r>
-        <w:t xml:space="preserve">Telegram: @leonchek97  |  GitHub: </w:t>
+        <w:t>Telegram: @leonchek97  |  GitHub: github.com/leonidchekin55  |  Portfolio: leonid-portfolio.onrender.com</w:t>
       </w:r>
-      <w:hyperlink r:id="rId9">
-        <w:r>
-          <w:rPr>
-            <w:rStyle w:val="Hyperlink"/>
-          </w:rPr>
-          <w:t>github.com/leonidchekin55</w:t>
-        </w:r>
-      </w:hyperlink>
-      <w:r>
-        <w:t xml:space="preserve">  |  Portfolio: </w:t>
-      </w:r>
-      <w:hyperlink r:id="rId10">
-        <w:r>
-          <w:rPr>
-            <w:rStyle w:val="Hyperlink"/>
-          </w:rPr>
-          <w:t>leonid-portfolio.onrender.com</w:t>
-        </w:r>
-      </w:hyperlink>
     </w:p>
     <w:p>
       <w:pPr>
@@ -327,10 +308,10 @@
         <w:rPr>
           <w:b/>
         </w:rPr>
-        <w:t xml:space="preserve">AI and Business Process Automation. </w:t>
+        <w:t xml:space="preserve">AI Engineer Portfolio | Learning project. </w:t>
       </w:r>
       <w:r>
-        <w:t>Assistant workflows for incoming data, semantic deduplication, and CRM/Telegram integrations. Stack: Python, APIs, automation workflows.</w:t>
+        <w:t>Six FastAPI demos for structured intake, document processing, cited RAG, evals, and approval-gated actions. Public mode is mock-only. Stack: PostgreSQL/pgvector, Redis/Celery, FastEmbed, Docker.</w:t>
       </w:r>
     </w:p>
     <w:sectPr>

</xml_diff>

<commit_message>
Refresh resume and portfolio with verified project details
</commit_message>
<xml_diff>
--- a/downloads/Leonid_Chekin_Resume_AI_RAG_ATS.docx
+++ b/downloads/Leonid_Chekin_Resume_AI_RAG_ATS.docx
@@ -308,10 +308,10 @@
         <w:rPr>
           <w:b/>
         </w:rPr>
-        <w:t xml:space="preserve">AI Engineer Portfolio | Learning project. </w:t>
+        <w:t xml:space="preserve">AI Engineer Portfolio | Personal project. Six FastAPI demos for lead intake, cited document search, batch processing, evaluations, monitoring, and safe agent actions. Public demos use mock integrations; real CRM/email writes are disabled.</w:t>
       </w:r>
       <w:r>
-        <w:t>Six FastAPI demos for structured intake, document processing, cited RAG, evals, and approval-gated actions. Public mode is mock-only. Stack: PostgreSQL/pgvector, Redis/Celery, FastEmbed, Docker.</w:t>
+        <w:t/>
       </w:r>
     </w:p>
     <w:sectPr>

</xml_diff>